<commit_message>
Amplia la presentazione di I Luoghi dell'Anima e la fa scorrere su più pagine
Testo della mostra in sei paragrafi titolati; il catalogo lo impagina su
quante pagine servono e prepara anche la versione per Google Docs.

Co-Authored-By: Claude Opus 5.5 <noreply@anthropic.com>
Claude-Session: https://claude.ai/code/session_0148bZgqQiCtdshijf84M1Qp
</commit_message>
<xml_diff>
--- a/testi-critici/mostre/catalogo/i-luoghi-dell-anima.docx
+++ b/testi-critici/mostre/catalogo/i-luoghi-dell-anima.docx
@@ -104,7 +104,7 @@
           <w:color w:val="1E1B18"/>
           <w:sz w:val="24"/>
         </w:rPr>
-        <w:t>Ognuno ha un luogo in cui torna, anche solo con il pensiero: una stanza della casa d’infanzia, un tratto di mare, un sentiero di campagna, la terra da cui si è partiti. Per questa collettiva abbiamo chiesto agli artisti di portarci il loro. Ne è nata una mostra di luoghi ricordati più che descritti, dove la memoria ordina lo spazio e la materia trattiene il tempo.</w:t>
+        <w:t>Ognuno ha un luogo in cui torna, anche solo con il pensiero. Può essere una stanza della casa d’infanzia, un tratto di mare visto una volta e mai dimenticato, un sentiero di campagna, la terra da cui si è partiti. Non sta sulle mappe e non ha un indirizzo: esiste perché qualcuno lo ricorda, e ogni volta che lo ricorda lo ricostruisce un po’ diverso. È questo che chiamiamo luogo dell’anima.</w:t>
       </w:r>
     </w:p>
     <w:p>
@@ -120,7 +120,24 @@
           <w:color w:val="1E1B18"/>
           <w:sz w:val="24"/>
         </w:rPr>
-        <w:t>Le strade sono molte. Stefano Mugnaioni lascia riaffiorare la natura da strati di colore e carta stampata; Tonino Giampà riduce la sua Calabria a un orizzonte e a una luce. Patrizia Vangelisti custodisce un angolo di casa come uno scrigno, Catia Massai apre un arco di pietra su un giardino in cui entrare. Maria Cristina Andreini accompagna le sue figure fino all’acqua, sul confine fra il quotidiano e la libertà; Enzo Mazzanti segue un viandante solitario attraverso paesaggi che cambiano con il suo stato d’animo. E.B.Art costruisce i suoi luoghi strato su strato, in una materia che si trasforma senza perdersi.</w:t>
+        <w:t>Per questa collettiva abbiamo chiesto agli artisti di portarci il loro. Ne è nata una mostra di luoghi ricordati più che descritti, in cui la memoria ordina lo spazio, la materia trattiene il tempo e lo sguardo di chi visita è invitato a fare lo stesso: a cercare, fra le opere, un luogo che gli somigli.</w:t>
+      </w:r>
+    </w:p>
+    <w:p>
+      <w:pPr>
+        <w:pStyle w:val="Heading2"/>
+        <w:keepNext/>
+        <w:spacing w:before="240" w:after="80"/>
+      </w:pPr>
+      <w:r>
+        <w:rPr>
+          <w:rFonts w:ascii="Garamond" w:hAnsi="Garamond" w:eastAsia="Garamond"/>
+          <w:b w:val="0"/>
+          <w:i/>
+          <w:color w:val="1E1B18"/>
+          <w:sz w:val="30"/>
+        </w:rPr>
+        <w:t>Un luogo che non sta sulle mappe</w:t>
       </w:r>
     </w:p>
     <w:p>
@@ -136,7 +153,7 @@
           <w:color w:val="1E1B18"/>
           <w:sz w:val="24"/>
         </w:rPr>
-        <w:t>Accanto agli artisti, una collezione privata: nature morte di fiori, marine, strade di campagna, una veduta della Costiera. Sono quadri nati per le case, comprati per arredare fra gli anni Settanta e Novanta, spesso firmati da mani che oggi non hanno più un nome. Li esponiamo perché raccontano il luogo dell’anima più condiviso di tutti: il mondo portato dentro una stanza, il mazzo che non appassisce, la finestra su un orizzonte lontano.</w:t>
+        <w:t>Un luogo dell’anima non coincide con un posto. Coincide con quello che quel posto ci fa provare: la quiete di una casa, il respiro largo del mare, la fatica buona di un cammino, la nostalgia di una terra lontana. Per questo le opere in mostra raramente mostrano un luogo riconoscibile. Più spesso ne mostrano l’emozione: una luce a una certa ora, un colore che torna, un gesto ripetuto.</w:t>
       </w:r>
     </w:p>
     <w:p>
@@ -152,7 +169,24 @@
           <w:color w:val="1E1B18"/>
           <w:sz w:val="24"/>
         </w:rPr>
-        <w:t>E poiché fra i luoghi dell’anima c’è anche la coscienza, due opere di E.B.Art, Holy Mother e J’accuse, presidiano due punti della galleria con lo sguardo di chi non deve essere dimenticato.</w:t>
+        <w:t>Molti dei lavori nascono da qui, dalla Piana fra Prato e Pistoia: Prato, Montemurlo, Lucca poco più in là. Eppure dentro le tele ci sono la Calabria, la Costiera, le Dolomiti, il mare aperto. È la prova più semplice di quello che la mostra racconta: si può abitare in un posto e avere l’anima altrove, e l’arte è uno dei modi in cui le due cose si tengono insieme.</w:t>
+      </w:r>
+    </w:p>
+    <w:p>
+      <w:pPr>
+        <w:pStyle w:val="Heading2"/>
+        <w:keepNext/>
+        <w:spacing w:before="240" w:after="80"/>
+      </w:pPr>
+      <w:r>
+        <w:rPr>
+          <w:rFonts w:ascii="Garamond" w:hAnsi="Garamond" w:eastAsia="Garamond"/>
+          <w:b w:val="0"/>
+          <w:i/>
+          <w:color w:val="1E1B18"/>
+          <w:sz w:val="30"/>
+        </w:rPr>
+        <w:t>La casa e il riparo</w:t>
       </w:r>
     </w:p>
     <w:p>
@@ -168,7 +202,219 @@
           <w:color w:val="1E1B18"/>
           <w:sz w:val="24"/>
         </w:rPr>
-        <w:t>Di sala in sala si rincorrono gli stessi fili: la soglia e il riparo, l’acqua, il cammino, la memoria. Fra le volte e i mattoni del palazzo di via San Pietro trovano una cornice che il tempo lo conosce bene.</w:t>
+        <w:t>Il primo luogo dell’anima è la casa. Patrizia Vangelisti la dipinge vista dall’alto, con la precisione di chi sa costruire: un angolo di stanza, un pavimento a esagoni, un’ampolla d’acqua dove nuota Arturo, il pesce rosso che custodisce i ricordi. Catia Massai la cerca fuori, in un giardino che si apre oltre un arco di pietra, in un albero così grande che servono cinque bambine per abbracciarlo.</w:t>
+      </w:r>
+    </w:p>
+    <w:p>
+      <w:pPr>
+        <w:spacing w:before="0" w:after="180" w:line="340" w:lineRule="exact"/>
+        <w:jc w:val="both"/>
+      </w:pPr>
+      <w:r>
+        <w:rPr>
+          <w:rFonts w:ascii="Garamond" w:hAnsi="Garamond" w:eastAsia="Garamond"/>
+          <w:b w:val="0"/>
+          <w:i w:val="0"/>
+          <w:color w:val="1E1B18"/>
+          <w:sz w:val="24"/>
+        </w:rPr>
+        <w:t>Alla casa appartengono anche i quadri della collezione privata: nature morte di fiori su fondo scuro, marine, strade di campagna, una veduta della Costiera. Sono nati per stare sopra una credenza o in un ingresso, comprati per arredare fra gli anni Settanta e Novanta, spesso firmati da mani che oggi non hanno più un nome. Li esponiamo accanto agli artisti perché raccontano il luogo dell’anima più condiviso di tutti: il mondo portato dentro una stanza, il mazzo che non appassisce, la finestra su un orizzonte lontano.</w:t>
+      </w:r>
+    </w:p>
+    <w:p>
+      <w:pPr>
+        <w:pStyle w:val="Heading2"/>
+        <w:keepNext/>
+        <w:spacing w:before="240" w:after="80"/>
+      </w:pPr>
+      <w:r>
+        <w:rPr>
+          <w:rFonts w:ascii="Garamond" w:hAnsi="Garamond" w:eastAsia="Garamond"/>
+          <w:b w:val="0"/>
+          <w:i/>
+          <w:color w:val="1E1B18"/>
+          <w:sz w:val="30"/>
+        </w:rPr>
+        <w:t>L’acqua e la soglia</w:t>
+      </w:r>
+    </w:p>
+    <w:p>
+      <w:pPr>
+        <w:spacing w:before="0" w:after="180" w:line="340" w:lineRule="exact"/>
+        <w:jc w:val="both"/>
+      </w:pPr>
+      <w:r>
+        <w:rPr>
+          <w:rFonts w:ascii="Garamond" w:hAnsi="Garamond" w:eastAsia="Garamond"/>
+          <w:b w:val="0"/>
+          <w:i w:val="0"/>
+          <w:color w:val="1E1B18"/>
+          <w:sz w:val="24"/>
+        </w:rPr>
+        <w:t>Il mare attraversa la mostra da una sala all’altra. Maria Cristina Andreini ci porta le sue figure femminili, dal volto nascosto, fino al bordo dell’acqua: un piede che sfiora le onde, le scarpe tenute in mano alla fine della festa. Lì il mare è il confine fra il quotidiano e la libertà. Nelle marine della collezione è invece un orizzonte da guardare da lontano, la partenza sognata e il ritorno al porto. In E.B.Art diventa un tramonto che si scioglie nei pastelli e un giardino sommerso di anemoni.</w:t>
+      </w:r>
+    </w:p>
+    <w:p>
+      <w:pPr>
+        <w:spacing w:before="0" w:after="180" w:line="340" w:lineRule="exact"/>
+        <w:jc w:val="both"/>
+      </w:pPr>
+      <w:r>
+        <w:rPr>
+          <w:rFonts w:ascii="Garamond" w:hAnsi="Garamond" w:eastAsia="Garamond"/>
+          <w:b w:val="0"/>
+          <w:i w:val="0"/>
+          <w:color w:val="1E1B18"/>
+          <w:sz w:val="24"/>
+        </w:rPr>
+        <w:t>Accanto all’acqua c’è la soglia. Un arco di pietra apre il giardino di Catia Massai e il vicolo dei Casolari amalfitani: due porte da attraversare con lo sguardo, che appese vicine si rispondono. Ogni opera della mostra, in fondo, è una soglia: un punto da cui si entra in un luogo che non è il nostro, e dal quale si torna un po’ cambiati.</w:t>
+      </w:r>
+    </w:p>
+    <w:p>
+      <w:pPr>
+        <w:pStyle w:val="Heading2"/>
+        <w:keepNext/>
+        <w:spacing w:before="240" w:after="80"/>
+      </w:pPr>
+      <w:r>
+        <w:rPr>
+          <w:rFonts w:ascii="Garamond" w:hAnsi="Garamond" w:eastAsia="Garamond"/>
+          <w:b w:val="0"/>
+          <w:i/>
+          <w:color w:val="1E1B18"/>
+          <w:sz w:val="30"/>
+        </w:rPr>
+        <w:t>La terra, l’orizzonte, il cammino</w:t>
+      </w:r>
+    </w:p>
+    <w:p>
+      <w:pPr>
+        <w:spacing w:before="0" w:after="180" w:line="340" w:lineRule="exact"/>
+        <w:jc w:val="both"/>
+      </w:pPr>
+      <w:r>
+        <w:rPr>
+          <w:rFonts w:ascii="Garamond" w:hAnsi="Garamond" w:eastAsia="Garamond"/>
+          <w:b w:val="0"/>
+          <w:i w:val="0"/>
+          <w:color w:val="1E1B18"/>
+          <w:sz w:val="24"/>
+        </w:rPr>
+        <w:t>C’è poi la terra. Tonino Giampà riduce la sua Calabria all’essenziale, una linea d’orizzonte, il cielo sopra, la terra sotto, e la carica di luce: il filo d’oro del tramonto, la nebbia, il rosso dei campi d’estate. Stefano Mugnaioni lascia che la natura riaffiori da strati di colore e carta stampata, come immagini che risalgono dalla memoria: una luna di luglio, le foglie d’autunno.</w:t>
+      </w:r>
+    </w:p>
+    <w:p>
+      <w:pPr>
+        <w:spacing w:before="0" w:after="180" w:line="340" w:lineRule="exact"/>
+        <w:jc w:val="both"/>
+      </w:pPr>
+      <w:r>
+        <w:rPr>
+          <w:rFonts w:ascii="Garamond" w:hAnsi="Garamond" w:eastAsia="Garamond"/>
+          <w:b w:val="0"/>
+          <w:i w:val="0"/>
+          <w:color w:val="1E1B18"/>
+          <w:sz w:val="24"/>
+        </w:rPr>
+        <w:t>E c’è il cammino. Enzo Mazzanti segue un viandante dal cappello rosso attraverso la neve, i vicoli stretti della città, un bosco acceso di rosa: sempre la stessa figura piccola e di spalle, mentre il mondo intorno cambia con il suo stato d’animo. Nelle Strade di campagna della collezione altre figure minute camminano in due, su sentieri sereni. La solitudine, qui, non è abbandono: è il tempo che serve per arrivare.</w:t>
+      </w:r>
+    </w:p>
+    <w:p>
+      <w:pPr>
+        <w:pStyle w:val="Heading2"/>
+        <w:keepNext/>
+        <w:spacing w:before="240" w:after="80"/>
+      </w:pPr>
+      <w:r>
+        <w:rPr>
+          <w:rFonts w:ascii="Garamond" w:hAnsi="Garamond" w:eastAsia="Garamond"/>
+          <w:b w:val="0"/>
+          <w:i/>
+          <w:color w:val="1E1B18"/>
+          <w:sz w:val="30"/>
+        </w:rPr>
+        <w:t>Il luogo della coscienza</w:t>
+      </w:r>
+    </w:p>
+    <w:p>
+      <w:pPr>
+        <w:spacing w:before="0" w:after="180" w:line="340" w:lineRule="exact"/>
+        <w:jc w:val="both"/>
+      </w:pPr>
+      <w:r>
+        <w:rPr>
+          <w:rFonts w:ascii="Garamond" w:hAnsi="Garamond" w:eastAsia="Garamond"/>
+          <w:b w:val="0"/>
+          <w:i w:val="0"/>
+          <w:color w:val="1E1B18"/>
+          <w:sz w:val="24"/>
+        </w:rPr>
+        <w:t>Fra i luoghi dell’anima c’è anche la coscienza. «La bellezza salverà il mondo», scrive Dostoevskij, ma solo se non distoglie lo sguardo. Holy Mother, dedicata alle madri di Palestina, e J’accuse, in cui una donna afghana che il regime fa scomparire punta gli occhi su chi la guarda, presidiano due punti della galleria. Con Terra promessa di Enzo Mazzanti, dedicata ai popoli scacciati dalla propria terra, ricordano che l’arte non è solo un rifugio: è anche un modo di tenere gli occhi aperti.</w:t>
+      </w:r>
+    </w:p>
+    <w:p>
+      <w:pPr>
+        <w:pStyle w:val="Heading2"/>
+        <w:keepNext/>
+        <w:spacing w:before="240" w:after="80"/>
+      </w:pPr>
+      <w:r>
+        <w:rPr>
+          <w:rFonts w:ascii="Garamond" w:hAnsi="Garamond" w:eastAsia="Garamond"/>
+          <w:b w:val="0"/>
+          <w:i/>
+          <w:color w:val="1E1B18"/>
+          <w:sz w:val="30"/>
+        </w:rPr>
+        <w:t>L’armonia delle differenze</w:t>
+      </w:r>
+    </w:p>
+    <w:p>
+      <w:pPr>
+        <w:spacing w:before="0" w:after="180" w:line="340" w:lineRule="exact"/>
+        <w:jc w:val="both"/>
+      </w:pPr>
+      <w:r>
+        <w:rPr>
+          <w:rFonts w:ascii="Garamond" w:hAnsi="Garamond" w:eastAsia="Garamond"/>
+          <w:b w:val="0"/>
+          <w:i w:val="0"/>
+          <w:color w:val="1E1B18"/>
+          <w:sz w:val="24"/>
+        </w:rPr>
+        <w:t>In mostra convivono linguaggi lontanissimi: l’informale materico e la figurazione realista, il gesto espressionista e la pittura narrativa, la veduta tradizionale e la tecnica multimaterica di E.B.Art, che costruisce i suoi paesaggi interiori con carta stropicciata, foglia d’argento e paste in rilievo. Ci sono artisti con una lunga storia di mostre e altri che hanno cominciato da poco, nomi riconosciuti e pittori di cui resta solo una firma.</w:t>
+      </w:r>
+    </w:p>
+    <w:p>
+      <w:pPr>
+        <w:spacing w:before="0" w:after="180" w:line="340" w:lineRule="exact"/>
+        <w:jc w:val="both"/>
+      </w:pPr>
+      <w:r>
+        <w:rPr>
+          <w:rFonts w:ascii="Garamond" w:hAnsi="Garamond" w:eastAsia="Garamond"/>
+          <w:b w:val="0"/>
+          <w:i w:val="0"/>
+          <w:color w:val="1E1B18"/>
+          <w:sz w:val="24"/>
+        </w:rPr>
+        <w:t>Non abbiamo cercato di uniformarli. Abbiamo cercato i fili che li legano: la memoria, la soglia, l’acqua, il cammino, il riparo. Messe una accanto all’altra, queste voci diverse non si coprono a vicenda: si rispondono, come in un coro dove ognuno canta la propria parte e l’insieme dice qualcosa che nessuno direbbe da solo.</w:t>
+      </w:r>
+    </w:p>
+    <w:p>
+      <w:pPr>
+        <w:spacing w:before="0" w:after="180" w:line="340" w:lineRule="exact"/>
+        <w:jc w:val="both"/>
+      </w:pPr>
+      <w:r>
+        <w:rPr>
+          <w:rFonts w:ascii="Garamond" w:hAnsi="Garamond" w:eastAsia="Garamond"/>
+          <w:b w:val="0"/>
+          <w:i w:val="0"/>
+          <w:color w:val="1E1B18"/>
+          <w:sz w:val="24"/>
+        </w:rPr>
+        <w:t>Fra le volte, le travi e i mattoni del palazzo di via San Pietro, queste opere trovano una cornice che il tempo lo conosce bene. Ognuno, attraversando le sale, troverà forse il proprio luogo dell’anima, o ne riconoscerà uno che credeva dimenticato.</w:t>
       </w:r>
       <w:r>
         <w:br w:type="page"/>
@@ -176,7 +422,9 @@
     </w:p>
     <w:p>
       <w:pPr>
-        <w:spacing w:before="0" w:after="0"/>
+        <w:pStyle w:val="Heading1"/>
+        <w:keepNext/>
+        <w:spacing w:before="0" w:after="80"/>
       </w:pPr>
       <w:r>
         <w:rPr>
@@ -354,7 +602,9 @@
     </w:p>
     <w:p>
       <w:pPr>
-        <w:spacing w:before="0" w:after="0"/>
+        <w:pStyle w:val="Heading1"/>
+        <w:keepNext/>
+        <w:spacing w:before="0" w:after="80"/>
       </w:pPr>
       <w:r>
         <w:rPr>
@@ -477,7 +727,9 @@
     </w:p>
     <w:p>
       <w:pPr>
-        <w:spacing w:before="0" w:after="0"/>
+        <w:pStyle w:val="Heading1"/>
+        <w:keepNext/>
+        <w:spacing w:before="0" w:after="80"/>
       </w:pPr>
       <w:r>
         <w:rPr>
@@ -655,7 +907,9 @@
     </w:p>
     <w:p>
       <w:pPr>
-        <w:spacing w:before="0" w:after="0"/>
+        <w:pStyle w:val="Heading1"/>
+        <w:keepNext/>
+        <w:spacing w:before="0" w:after="80"/>
       </w:pPr>
       <w:r>
         <w:rPr>
@@ -943,7 +1197,9 @@
     </w:p>
     <w:p>
       <w:pPr>
-        <w:spacing w:before="0" w:after="0"/>
+        <w:pStyle w:val="Heading1"/>
+        <w:keepNext/>
+        <w:spacing w:before="0" w:after="80"/>
       </w:pPr>
       <w:r>
         <w:rPr>
@@ -1121,7 +1377,9 @@
     </w:p>
     <w:p>
       <w:pPr>
-        <w:spacing w:before="0" w:after="0"/>
+        <w:pStyle w:val="Heading1"/>
+        <w:keepNext/>
+        <w:spacing w:before="0" w:after="80"/>
       </w:pPr>
       <w:r>
         <w:rPr>
@@ -1471,7 +1729,9 @@
     </w:p>
     <w:p>
       <w:pPr>
-        <w:spacing w:before="0" w:after="0"/>
+        <w:pStyle w:val="Heading1"/>
+        <w:keepNext/>
+        <w:spacing w:before="0" w:after="80"/>
       </w:pPr>
       <w:r>
         <w:rPr>
@@ -1523,7 +1783,9 @@
     </w:p>
     <w:p>
       <w:pPr>
-        <w:spacing w:before="0" w:after="0"/>
+        <w:pStyle w:val="Heading1"/>
+        <w:keepNext/>
+        <w:spacing w:before="0" w:after="80"/>
       </w:pPr>
       <w:r>
         <w:rPr>
@@ -1630,7 +1892,9 @@
     </w:p>
     <w:p>
       <w:pPr>
-        <w:spacing w:before="0" w:after="0"/>
+        <w:pStyle w:val="Heading1"/>
+        <w:keepNext/>
+        <w:spacing w:before="0" w:after="80"/>
       </w:pPr>
       <w:r>
         <w:rPr>
@@ -1682,7 +1946,9 @@
     </w:p>
     <w:p>
       <w:pPr>
-        <w:spacing w:before="0" w:after="0"/>
+        <w:pStyle w:val="Heading1"/>
+        <w:keepNext/>
+        <w:spacing w:before="0" w:after="80"/>
       </w:pPr>
       <w:r>
         <w:rPr>
@@ -1734,7 +2000,9 @@
     </w:p>
     <w:p>
       <w:pPr>
-        <w:spacing w:before="0" w:after="0"/>
+        <w:pStyle w:val="Heading1"/>
+        <w:keepNext/>
+        <w:spacing w:before="0" w:after="80"/>
       </w:pPr>
       <w:r>
         <w:rPr>
@@ -1912,7 +2180,9 @@
     </w:p>
     <w:p>
       <w:pPr>
-        <w:spacing w:before="0" w:after="0"/>
+        <w:pStyle w:val="Heading1"/>
+        <w:keepNext/>
+        <w:spacing w:before="0" w:after="80"/>
       </w:pPr>
       <w:r>
         <w:rPr>

</xml_diff>